<commit_message>
Align consent v02 and ethics form v02: durations, shift criteria, screening sheet, supervisor title
Co-Authored-By: Claude Sonnet 5.5 <noreply@anthropic.com>
</commit_message>
<xml_diff>
--- a/Berkas/Redcap Etik FKUI/Lembar Penjelasan dan Persetujuan (Informed Consent) - Vidya Cecilia v02.docx
+++ b/Berkas/Redcap Etik FKUI/Lembar Penjelasan dan Persetujuan (Informed Consent) - Vidya Cecilia v02.docx
@@ -338,7 +338,7 @@
         <w:rPr>
           <w:rFonts w:ascii="Times New Roman" w:eastAsia="Times New Roman" w:hAnsi="Times New Roman" w:cs="Times New Roman"/>
         </w:rPr>
-        <w:t>Bapak/Ibu/Saudara dipilih sebagai calon peserta penelitian karena bekerja di Instalasi Gizi RSUPN Dr. Cipto Mangunkusumo, berusia 18–55 tahun, dan telah bekerja pada posisi saat ini minimal 3 bulan.</w:t>
+        <w:t>Bapak/Ibu/Saudara dipilih sebagai calon peserta penelitian karena bekerja di Instalasi Gizi RSUPN Dr. Cipto Mangunkusumo, berusia 18–55 tahun, telah bekerja pada posisi saat ini minimal 3 bulan, dan bekerja pada shift subuh, pagi, atau siang.</w:t>
       </w:r>
     </w:p>
     <w:p>
@@ -595,7 +595,7 @@
           <w:rFonts w:ascii="Times New Roman" w:eastAsia="Times New Roman" w:hAnsi="Times New Roman" w:cs="Times New Roman"/>
           <w:lang w:val="da-DK"/>
         </w:rPr>
-        <w:t>Bila Bapak/Ibu/Saudara tidak dapat memenuhi salah satu persiapan di atas, mohon sampaikan dengan jujur kepada peneliti. Tidak ada sanksi atau akibat apa pun terhadap pekerjaan Bapak/Ibu/Saudara. Setelah shift kerja selesai, Bapak/Ibu/Saudara akan beristirahat sekitar 15–30 menit di ruangan yang sejuk sebelum pemeriksaan kulit, kemudian darah diambil pada 30–60 menit setelah shift berakhir. Darah hanya diambil satu kali, digunakan untuk memeriksa kadar hidrogen peroksida (H₂O₂) dalam plasma di laboratorium Departemen Biokimia dan Biologi Molekuler FKUI.</w:t>
+        <w:t>Bila Bapak/Ibu/Saudara tidak dapat memenuhi salah satu persiapan di atas, mohon sampaikan dengan jujur kepada peneliti. Pada hari pemeriksaan, peneliti akan menanyakan kembali kesiapan Bapak/Ibu/Saudara melalui lembar penyaring. Tidak ada sanksi atau akibat apa pun terhadap pekerjaan Bapak/Ibu/Saudara. Setelah shift kerja selesai, Bapak/Ibu/Saudara akan beristirahat sekitar 15–30 menit di ruangan yang sejuk sebelum pemeriksaan kulit, kemudian darah diambil pada 30–60 menit setelah shift berakhir. Darah hanya diambil satu kali, digunakan untuk memeriksa kadar hidrogen peroksida (H₂O₂) dalam plasma di laboratorium Departemen Biokimia dan Biologi Molekuler FKUI.</w:t>
       </w:r>
     </w:p>
     <w:p>

</xml_diff>